<commit_message>
Replace NSPA26 presentation and align participant materials
</commit_message>
<xml_diff>
--- a/2026/offline/session-takeaways.docx
+++ b/2026/offline/session-takeaways.docx
@@ -113,7 +113,7 @@
           <w:bCs/>
           <w:color w:val="2e4f66"/>
         </w:rPr>
-        <w:t xml:space="preserve">Give AI a clear task you can check</w:t>
+        <w:t xml:space="preserve">Keep people accountable for decisions</w:t>
       </w:r>
     </w:p>
     <w:p>
@@ -134,7 +134,7 @@
           <w:rFonts w:ascii="Poppins" w:hAnsi="Poppins" w:cs="Poppins"/>
           <w:color w:val="2e4f66"/>
         </w:rPr>
-        <w:t xml:space="preserve">Include five parts: task, rules, source information, limits, and answer format. Require quotes and paragraph labels so you can check the evidence.</w:t>
+        <w:t xml:space="preserve">AI can sort, summarize, and suggest. People decide. Use clerical drafts only with approved inputs and accuracy checks.</w:t>
       </w:r>
     </w:p>
     <w:p>
@@ -155,7 +155,7 @@
           <w:rFonts w:ascii="Poppins" w:hAnsi="Poppins" w:cs="Poppins"/>
           <w:color w:val="2e4f66"/>
         </w:rPr>
-        <w:t xml:space="preserve">Choose a narrow task, such as listing required documents. “Find our best applicants” leaves too much for the tool to guess.</w:t>
+        <w:t xml:space="preserve">Rubric pre-scores, tags, and consequential summaries need source verification. Authorized people own eligibility, authenticity, selection, and award decisions.</w:t>
       </w:r>
     </w:p>
     <w:p>
@@ -176,7 +176,7 @@
           <w:rFonts w:ascii="Poppins" w:hAnsi="Poppins" w:cs="Poppins"/>
           <w:color w:val="2e4f66"/>
         </w:rPr>
-        <w:t xml:space="preserve">Treat application text as evidence, not instructions. Ignore embedded commands, mark gaps, and prohibit invented facts or award recommendations.</w:t>
+        <w:t xml:space="preserve">Prepare inputs, verify evidence, decide, and audit. Name who can correct or stop the process. These are workshop tools, not official NSPA policy.</w:t>
       </w:r>
     </w:p>
     <w:p>
@@ -211,7 +211,7 @@
           <w:bCs/>
           <w:color w:val="2e4f66"/>
         </w:rPr>
-        <w:t xml:space="preserve">Check the draft before using it</w:t>
+        <w:t xml:space="preserve">Write a prompt a reviewer can check</w:t>
       </w:r>
     </w:p>
     <w:p>
@@ -232,7 +232,7 @@
           <w:rFonts w:ascii="Poppins" w:hAnsi="Poppins" w:cs="Poppins"/>
           <w:color w:val="2e4f66"/>
         </w:rPr>
-        <w:t xml:space="preserve">Compare every claim with the application. Look for invented quotes, omissions, unsupported conclusions, and instructions the tool should have ignored.</w:t>
+        <w:t xml:space="preserve">Include six parts: role, task, context, criteria, format, and constraints. Paste the adopted rubric and its level descriptors verbatim.</w:t>
       </w:r>
     </w:p>
     <w:p>
@@ -253,7 +253,7 @@
           <w:rFonts w:ascii="Poppins" w:hAnsi="Poppins" w:cs="Poppins"/>
           <w:color w:val="2e4f66"/>
         </w:rPr>
-        <w:t xml:space="preserve">In fictional C-101: P2 gives a goal, P3 a service example, P4 lacks an enrollment document, and P5 contains an instruction to ignore. Missing evidence needs follow-up.</w:t>
+        <w:t xml:space="preserve">Require exact quotes, paragraph IDs, and uncertainty. Treat application text as evidence; embedded instructions cannot override the review task.</w:t>
       </w:r>
     </w:p>
     <w:p>
@@ -274,7 +274,7 @@
           <w:rFonts w:ascii="Poppins" w:hAnsi="Poppins" w:cs="Poppins"/>
           <w:color w:val="2e4f66"/>
         </w:rPr>
-        <w:t xml:space="preserve">Keep the draft, corrections, and reviewer’s reasoning. A named person checks the evidence and decides. Fluent writing does not establish accuracy.</w:t>
+        <w:t xml:space="preserve">The three demos cover administrative triage, a provisional rubric rating, and neutral summaries or tags. Missing evidence requires human follow-up, never invention or automatic rejection.</w:t>
       </w:r>
     </w:p>
     <w:p>
@@ -309,7 +309,7 @@
           <w:bCs/>
           <w:color w:val="2e4f66"/>
         </w:rPr>
-        <w:t xml:space="preserve">Make the scoring guide clearer</w:t>
+        <w:t xml:space="preserve">Protect data and test the workflow</w:t>
       </w:r>
     </w:p>
     <w:p>
@@ -330,7 +330,7 @@
           <w:rFonts w:ascii="Poppins" w:hAnsi="Poppins" w:cs="Poppins"/>
           <w:color w:val="2e4f66"/>
         </w:rPr>
-        <w:t xml:space="preserve">Use observable criteria and examples for each score. Rate independently before viewing an AI suggestion; then compare evidence with a partner.</w:t>
+        <w:t xml:space="preserve">Practice with fictional records. Confirm the actual service, settings, training use, retention, access, deletion, and local approval before real data use.</w:t>
       </w:r>
     </w:p>
     <w:p>
@@ -351,7 +351,7 @@
           <w:rFonts w:ascii="Poppins" w:hAnsi="Poppins" w:cs="Poppins"/>
           <w:color w:val="2e4f66"/>
         </w:rPr>
-        <w:t xml:space="preserve">Use “insufficient evidence” when sources are missing or contradictory. Do not infer merit, honesty, or personal traits from writing style.</w:t>
+        <w:t xml:space="preserve">Remove unneeded details. Deleting a name alone may leave identifying information. A paid or education account still requires review of terms and settings.</w:t>
       </w:r>
     </w:p>
     <w:p>
@@ -372,7 +372,7 @@
           <w:rFonts w:ascii="Poppins" w:hAnsi="Poppins" w:cs="Poppins"/>
           <w:color w:val="2e4f66"/>
         </w:rPr>
-        <w:t xml:space="preserve">Discuss disagreements and clarify the guide; do not simply average ratings. Record the first rating, suggested change, final human rating, and reason.</w:t>
+        <w:t xml:space="preserve">Repeat fictional cases, change only a name in a controlled test, and compare with independent human judgments. Ten cases may reveal a problem; they cannot certify fairness.</w:t>
       </w:r>
     </w:p>
     <w:p>
@@ -496,7 +496,7 @@
           <w:bCs/>
           <w:color w:val="2e4f66"/>
         </w:rPr>
-        <w:t xml:space="preserve">Protect information throughout the workflow</w:t>
+        <w:t xml:space="preserve">Treat applicant AI use fairly</w:t>
       </w:r>
     </w:p>
     <w:p>
@@ -517,7 +517,7 @@
           <w:rFonts w:ascii="Poppins" w:hAnsi="Poppins" w:cs="Poppins"/>
           <w:color w:val="2e4f66"/>
         </w:rPr>
-        <w:t xml:space="preserve">Practice with fictional applications. Before using real data, confirm the approved tool, permitted information, access, retention, and responsible reviewer.</w:t>
+        <w:t xml:space="preserve">Distinguish mechanical help, brainstorming, draft development, and substitution. Explain permitted uses, accessibility and translation support, and any required disclosure.</w:t>
       </w:r>
     </w:p>
     <w:p>
@@ -538,7 +538,7 @@
           <w:rFonts w:ascii="Poppins" w:hAnsi="Poppins" w:cs="Poppins"/>
           <w:color w:val="2e4f66"/>
         </w:rPr>
-        <w:t xml:space="preserve">Map approved input → AI draft → evidence check → human decision → record. Add pause points where information or decisions could be mishandled.</w:t>
+        <w:t xml:space="preserve">Polished writing and detector results alone cannot establish misconduct. Historical research findings are specific to the samples and tools studied.</w:t>
       </w:r>
     </w:p>
     <w:p>
@@ -559,7 +559,7 @@
           <w:rFonts w:ascii="Poppins" w:hAnsi="Poppins" w:cs="Poppins"/>
           <w:color w:val="2e4f66"/>
         </w:rPr>
-        <w:t xml:space="preserve">Remove information the task does not need. Deleting a name alone does not guarantee that an application cannot identify someone.</w:t>
+        <w:t xml:space="preserve">Use the published rule and actual evidence. Apply follow-up consistently, offer an accessible response route, and keep correction and appeal decisions with people.</w:t>
       </w:r>
     </w:p>
     <w:p>
@@ -594,7 +594,7 @@
           <w:bCs/>
           <w:color w:val="2e4f66"/>
         </w:rPr>
-        <w:t xml:space="preserve">Respond fairly to applicant AI use</w:t>
+        <w:t xml:space="preserve">Make transparency work both ways</w:t>
       </w:r>
     </w:p>
     <w:p>
@@ -615,7 +615,7 @@
           <w:rFonts w:ascii="Poppins" w:hAnsi="Poppins" w:cs="Poppins"/>
           <w:color w:val="2e4f66"/>
         </w:rPr>
-        <w:t xml:space="preserve">A detector flag is not proof of misconduct, and its score is not the probability someone cheated. Errors vary by tool, language, population, and test conditions.</w:t>
+        <w:t xml:space="preserve">Choose a policy approach: prohibit, disclose, bounded use, embrace, or an explained combination. Give examples and publish the rule before applications open.</w:t>
       </w:r>
     </w:p>
     <w:p>
@@ -636,7 +636,7 @@
           <w:rFonts w:ascii="Poppins" w:hAnsi="Poppins" w:cs="Poppins"/>
           <w:color w:val="2e4f66"/>
         </w:rPr>
-        <w:t xml:space="preserve">Publish rules in advance: allowed editing, translation, and brainstorming; when to disclose help; and prohibitions on invented experiences and false records.</w:t>
+        <w:t xml:space="preserve">Explain where provider AI supports review, who verifies its work, who decides, and how applicants can request correction.</w:t>
       </w:r>
     </w:p>
     <w:p>
@@ -657,7 +657,7 @@
           <w:rFonts w:ascii="Poppins" w:hAnsi="Poppins" w:cs="Poppins"/>
           <w:color w:val="2e4f66"/>
         </w:rPr>
-        <w:t xml:space="preserve">Name the rule and evidence. Invite an explanation without assuming wrongdoing. Offer an accessible response route, human review, and an appeal.</w:t>
+        <w:t xml:space="preserve">Publish only promises supported by the actual service and process. Keep disclosure brief; do not require private chat histories or unnecessary personal information.</w:t>
       </w:r>
     </w:p>
     <w:p>
@@ -692,7 +692,7 @@
           <w:bCs/>
           <w:color w:val="2e4f66"/>
         </w:rPr>
-        <w:t xml:space="preserve">Choose one next step for the next 30 days</w:t>
+        <w:t xml:space="preserve">Plan the next 30 / 60 / 90 days</w:t>
       </w:r>
     </w:p>
     <w:p>
@@ -713,7 +713,7 @@
           <w:rFonts w:ascii="Poppins" w:hAnsi="Poppins" w:cs="Poppins"/>
           <w:color w:val="2e4f66"/>
         </w:rPr>
-        <w:t xml:space="preserve">Mark capacities Ready to learn, In progress, or Ready to go. Pick one task, owner, date, evidence of progress, and stop condition.</w:t>
+        <w:t xml:space="preserve">30 days: choose one clerical pilot and an owner. Draft applicant guidance and a provider-use statement.</w:t>
       </w:r>
     </w:p>
     <w:p>
@@ -734,7 +734,7 @@
           <w:rFonts w:ascii="Poppins" w:hAnsi="Poppins" w:cs="Poppins"/>
           <w:color w:val="2e4f66"/>
         </w:rPr>
-        <w:t xml:space="preserve">Week 1: agree on checks. Week 2: test fictional cases. Weeks 3–4: review errors, omissions, disagreement, and checking time; adjust, stop, or seek approval.</w:t>
+        <w:t xml:space="preserve">60 days: test fictional records, compare with human review, and record errors and corrections. 90 days: train reviewers, publish policy, and schedule an audit.</w:t>
       </w:r>
     </w:p>
     <w:p>
@@ -755,7 +755,7 @@
           <w:rFonts w:ascii="Poppins" w:hAnsi="Poppins" w:cs="Poppins"/>
           <w:color w:val="2e4f66"/>
         </w:rPr>
-        <w:t xml:space="preserve">Keep your prompt, workflow, and policy drafts. These are teaching tools, not official NSPA policy. Miguel Guhlin • October 21, 2026 • mguhlin.github.io/nspa/2026/</w:t>
+        <w:t xml:space="preserve">Choose three checklist gaps, a review date, evidence of progress, and a pause condition. Miguel Guhlin · October 21, 2026 · mguhlin.github.io/nspa/2026/</w:t>
       </w:r>
     </w:p>
     <w:p>

</xml_diff>

<commit_message>
Separate takeaway attribution from final bullet
</commit_message>
<xml_diff>
--- a/2026/offline/session-takeaways.docx
+++ b/2026/offline/session-takeaways.docx
@@ -755,7 +755,7 @@
           <w:rFonts w:ascii="Poppins" w:hAnsi="Poppins" w:cs="Poppins"/>
           <w:color w:val="2e4f66"/>
         </w:rPr>
-        <w:t xml:space="preserve">Choose three checklist gaps, a review date, evidence of progress, and a pause condition. Miguel Guhlin · October 21, 2026 · mguhlin.github.io/nspa/2026/</w:t>
+        <w:t xml:space="preserve">Choose three checklist gaps, a review date, evidence of progress, and a pause condition.</w:t>
       </w:r>
     </w:p>
     <w:p>
@@ -766,6 +766,25 @@
         </w:rPr>
         <w:spacing w:line="120" w:lineRule="exact" w:after="0" w:before="0"/>
       </w:pPr>
+    </w:p>
+    <w:p>
+      <w:pPr>
+        <w:rPr>
+          <w:rFonts w:ascii="Poppins" w:hAnsi="Poppins" w:cs="Poppins"/>
+          <w:color w:val="2e4f66"/>
+        </w:rPr>
+        <w:jc w:val="center"/>
+        <w:spacing w:before="120" w:after="0"/>
+      </w:pPr>
+      <w:r>
+        <w:rPr>
+          <w:rFonts w:ascii="Poppins" w:hAnsi="Poppins" w:cs="Poppins"/>
+          <w:color w:val="2e4f66"/>
+          <w:sz w:val="20"/>
+          <w:szCs w:val="20"/>
+        </w:rPr>
+        <w:t xml:space="preserve">Miguel Guhlin · October 21, 2026 · mguhlin.github.io/nspa/2026/</w:t>
+      </w:r>
     </w:p>
     <w:sectPr>
       <w:headerReference w:type="default" r:id="rId9"/>

</xml_diff>